<commit_message>
Revise artigo WCAA em português
</commit_message>
<xml_diff>
--- a/docs/Artigo_IIIWCAA_Alerta_Quedas_Leite.docx
+++ b/docs/Artigo_IIIWCAA_Alerta_Quedas_Leite.docx
@@ -101,7 +101,7 @@
           <w:i w:val="0"/>
           <w:sz w:val="17"/>
         </w:rPr>
-        <w:t>Resumo: Este estudo investiga um problema distinto da previsão de volumes: identificar municípios com queda anual de produção de leite igual ou superior a 10%. A partir da PPM/IBGE-SIDRA (tabela 74, produto 2682) e do painel agroclimático público já integrado, foram usados somente atributos disponíveis até t-1. Random Forest e XGBoost foram avaliados em teste temporal 2017-2019 (1.197 observações); a prevalência de quedas foi 24,1%. Os resultados ficaram próximos da referência sem queda, indicando que esses dados não sustentaram um alerta confiável neste recorte.</w:t>
+        <w:t>Resumo: Este estudo investiga um problema distinto da previsão de volumes: identificar municípios com queda anual de produção de leite igual ou superior a 10%. A partir da PPM/IBGE-SIDRA (tabela 74, produto 2682) e do painel agroclimático público já integrado, foram usados somente atributos disponíveis até t-1. Floresta Aleatória e XGBoost foram avaliados em teste temporal 2017-2019 (1.197 observações); a prevalência de quedas foi 24,1%. Os resultados ficaram próximos da referência sem queda, indicando que esses dados não sustentaram um alerta confiável neste recorte.</w:t>
       </w:r>
     </w:p>
     <w:p>
@@ -116,13 +116,13 @@
           <w:i w:val="0"/>
           <w:sz w:val="16"/>
         </w:rPr>
-        <w:t>Palavras-chave: produção leiteira; classificação; alerta de queda; Random Forest; XGBoost.</w:t>
+        <w:t>Palavras-chave: produção leiteira; classificação; alerta de queda; floresta aleatória; XGBoost.</w:t>
       </w:r>
     </w:p>
     <w:p>
       <w:pPr>
         <w:keepNext/>
-        <w:spacing w:after="60" w:before="100" w:line="240" w:lineRule="auto"/>
+        <w:spacing w:after="40" w:before="60" w:line="240" w:lineRule="auto"/>
         <w:jc w:val="left"/>
       </w:pPr>
       <w:r>
@@ -147,13 +147,13 @@
           <w:i w:val="0"/>
           <w:sz w:val="16"/>
         </w:rPr>
-        <w:t>A produção municipal de leite pode variar entre anos, e reconhecer retrações expressivas é um problema diferente de estimar o volume produzido. Estudos de aprendizagem de máquina no setor leiteiro concentram-se sobretudo em predição produtiva e manejo, com desempenho dependente da escala e das variáveis observadas (Slob et al., 2021; Palma et al., 2025). Em vez de estimar um valor contínuo, este estudo define uma tarefa de classificação de quedas anuais, sem inferir causas.</w:t>
+        <w:t>A aprendizagem de máquina tem sido aplicada à predição da produção e ao manejo leiteiro, em tarefas cuja escala e desempenho dependem dos dados disponíveis (Slob et al., 2021; Palma et al., 2025). Estudos modelaram séries mensais de leite em sistemas de pastagem (Perez-Guerra et al., 2023) e produção nacional com dados climáticos e econômicos (Cesarini et al., 2024). Na agricultura brasileira, clima e sensoriamento remoto também foram integrados para prever produtividade municipal de soja (von Bloh et al., 2023). Esses trabalhos estimam volumes; este artigo propõe um recorte diferente: classificar retrações anuais da produção leiteira municipal, sem atribuir causas, e avaliar se dados públicos defasados permitem sinalizá-las.</w:t>
       </w:r>
     </w:p>
     <w:p>
       <w:pPr>
         <w:keepNext/>
-        <w:spacing w:after="60" w:before="100" w:line="240" w:lineRule="auto"/>
+        <w:spacing w:after="40" w:before="60" w:line="240" w:lineRule="auto"/>
         <w:jc w:val="left"/>
       </w:pPr>
       <w:r>
@@ -178,12 +178,12 @@
           <w:i w:val="0"/>
           <w:sz w:val="16"/>
         </w:rPr>
-        <w:t>A unidade foi município-ano, usando 399 municípios e a produção anual da PPM/IBGE, tabela SIDRA 74, produto leite 2682 (https://sidra.ibge.gov.br/tabela/74). O alvo é 1 quando (produção_t / produção_t-1) - 1 ≤ -0,10; o limiar de 10% é uma definição operacional deste estudo. O painel reutiliza fontes públicas da análise de regressão do grupo, mas muda a variável-resposta e a tarefa: classificação de quedas, não estimativa de volume. Os preditores foram produção em t-1 e t-2, crescimento até t-1, ano, código municipal e variáveis meteorológicas da estação INMET A819 de Castro agregadas ao ano anterior (https://portal.inmet.gov.br/dadoshistoricos). Não se usou clima do ano-alvo. A análise usa 2008-2019; dados ausentes nos lags necessários foram excluídos.</w:t>
-      </w:r>
-    </w:p>
-    <w:p>
-      <w:pPr>
-        <w:spacing w:after="60" w:before="0" w:line="240" w:lineRule="auto"/>
+        <w:t>A unidade município-ano abrange 399 municípios. A produção anual (mil litros) vem da PPM/IBGE-SIDRA, tabela 74, produto leite 2682 (https://sidra.ibge.gov.br/tabela/74). O alvo vale 1 quando a queda ante t-1 é de pelo menos 10%, limiar operacional. Preditores: produção em t-1/t-2, crescimento até t-1, ano, código municipal categórico e clima defasado da estação INMET A819, em Castro (https://portal.inmet.gov.br/dadoshistoricos): precipitação, temperaturas média e máxima média, radiação, umidade, vento e dias secos aproximados. O clima de t não prevê o próprio t; após remover ausências necessárias aos lags, modelaram-se 2008-2019. O clima de Castro é comum aos municípios, e o alvo classifica quedas, não volume.</w:t>
+      </w:r>
+    </w:p>
+    <w:p>
+      <w:pPr>
+        <w:spacing w:after="40" w:before="0" w:line="240" w:lineRule="auto"/>
         <w:jc w:val="both"/>
       </w:pPr>
       <w:r>
@@ -193,13 +193,13 @@
           <w:i w:val="0"/>
           <w:sz w:val="16"/>
         </w:rPr>
-        <w:t>Compararam-se Random Forest (RF) e XGBoost (XGB) com baseline que classifica todos os casos como ‘sem queda’. Hiperparâmetros foram escolhidos por average precision em folds temporais completos de 2015 e 2016, sempre treinando em anos anteriores; o ajuste final usou dados até 2016 e teste intocado em 2017-2019. RF pesquisou 200/500 árvores, profundidade 6/12 e folha mínima 2/5, com pesos balanceados; selecionou 500, 12 e 5. XGB pesquisou 150/300 árvores, profundidade 2/4 e taxa 0,03/0,08, com amostragens 0,8; selecionou 150, 2 e 0,08. O limiar probabilístico foi fixo em 0,5. Métricas: precisão, sensibilidade (recall), F1, acurácia balanceada, average precision (AP) e ROC-AUC. Código e saídas: https://github.com/GabyQueiroz/CITREN_leite, script scripts/build_decline_risk_models.py.</w:t>
+        <w:t>Compararam-se Floresta Aleatória (RF) e XGBoost (XGB) com a referência ‘sem queda’. A precisão média (AP) selecionou hiperparâmetros em validações cronológicas de 2015 e 2016, treinadas apenas com anos anteriores; 2017-2019 ficou como teste intocado. No RF, a busca combinou 200/500 árvores, profundidade 6/12 e folha mínima 2/5, com pesos balanceados; selecionou 500, 12 e 5. No XGB, testaram-se 150/300 árvores, profundidade 2/4, taxa 0,03/0,08 e subamostragens de 0,8; selecionou 150, 2 e 0,08. Usou-se limiar 0,5. Métricas: precisão, sensibilidade, F1, acurácia balanceada, AP e área sob a curva ROC (ROC-AUC). Código: https://github.com/GabyQueiroz/CITREN_leite, script scripts/build_decline_risk_models.py.</w:t>
       </w:r>
     </w:p>
     <w:p>
       <w:pPr>
         <w:keepNext/>
-        <w:spacing w:after="60" w:before="100" w:line="240" w:lineRule="auto"/>
+        <w:spacing w:after="40" w:before="60" w:line="240" w:lineRule="auto"/>
         <w:jc w:val="left"/>
       </w:pPr>
       <w:r>
@@ -209,7 +209,7 @@
           <w:i w:val="0"/>
           <w:sz w:val="20"/>
         </w:rPr>
-        <w:t>3. Resultados e Discussão</w:t>
+        <w:t>3. Resultados</w:t>
       </w:r>
     </w:p>
     <w:tbl>
@@ -225,6 +225,12 @@
           <w:insideH w:val="single" w:sz="4" w:color="AAB8B8"/>
           <w:insideV w:val="single" w:sz="4" w:color="AAB8B8"/>
         </w:tblBorders>
+        <w:tblCellMar>
+          <w:top w:w="20" w:type="dxa"/>
+          <w:bottom w:w="20" w:type="dxa"/>
+          <w:left w:w="40" w:type="dxa"/>
+          <w:right w:w="40" w:type="dxa"/>
+        </w:tblCellMar>
       </w:tblPr>
       <w:tblGrid>
         <w:gridCol w:w="1607"/>
@@ -237,6 +243,31 @@
       <w:tr>
         <w:trPr>
           <w:cantSplit/>
+        </w:trPr>
+        <w:tc>
+          <w:tcPr>
+            <w:tcW w:type="dxa" w:w="576"/>
+            <w:gridSpan w:val="6"/>
+          </w:tcPr>
+          <w:p>
+            <w:pPr>
+              <w:spacing w:after="20"/>
+              <w:jc w:val="center"/>
+            </w:pPr>
+            <w:r>
+              <w:rPr>
+                <w:rFonts w:ascii="Times New Roman" w:hAnsi="Times New Roman"/>
+                <w:i/>
+                <w:sz w:val="13"/>
+              </w:rPr>
+              <w:t>Tabela 1. Métricas de classificação no teste temporal (2017-2019). Fonte: elaboração própria.</w:t>
+            </w:r>
+          </w:p>
+        </w:tc>
+      </w:tr>
+      <w:tr>
+        <w:trPr>
+          <w:cantSplit/>
           <w:tblHeader w:val="true"/>
         </w:trPr>
         <w:tc>
@@ -361,7 +392,7 @@
                 <w:color w:val="1F4E4D"/>
                 <w:sz w:val="12"/>
               </w:rPr>
-              <w:t>AUC</w:t>
+              <w:t>ROC-AUC</w:t>
             </w:r>
           </w:p>
         </w:tc>
@@ -384,7 +415,7 @@
                 <w:rFonts w:ascii="Times New Roman" w:hAnsi="Times New Roman"/>
                 <w:sz w:val="12"/>
               </w:rPr>
-              <w:t>Sem queda (baseline)</w:t>
+              <w:t>Sem queda (referência)</w:t>
             </w:r>
           </w:p>
         </w:tc>
@@ -497,7 +528,7 @@
                 <w:rFonts w:ascii="Times New Roman" w:hAnsi="Times New Roman"/>
                 <w:sz w:val="12"/>
               </w:rPr>
-              <w:t>Random Forest</w:t>
+              <w:t>Floresta Aleatória</w:t>
             </w:r>
           </w:p>
         </w:tc>
@@ -710,21 +741,6 @@
       <w:pPr>
         <w:spacing w:after="0"/>
       </w:pPr>
-    </w:p>
-    <w:p>
-      <w:pPr>
-        <w:spacing w:after="20" w:before="0" w:line="240" w:lineRule="auto"/>
-        <w:jc w:val="center"/>
-      </w:pPr>
-      <w:r>
-        <w:rPr>
-          <w:rFonts w:ascii="Times New Roman" w:hAnsi="Times New Roman"/>
-          <w:b w:val="0"/>
-          <w:i w:val="0"/>
-          <w:sz w:val="13"/>
-        </w:rPr>
-        <w:t>Tabela 1. Métricas de classificação no teste temporal (2017-2019). Fonte: elaboração própria.</w:t>
-      </w:r>
     </w:p>
     <w:p>
       <w:pPr>
@@ -795,7 +811,7 @@
           <w:i w:val="0"/>
           <w:sz w:val="16"/>
         </w:rPr>
-        <w:t>As quedas corresponderam a 24,1% do teste. O RF identificou 85 dos 289 casos (sensibilidade=0,29), mas gerou 296 falsos alertas e precisão de 0,22; sua AP (0,236) ficou abaixo da referência (0,241). O XGBoost obteve AP=0,242, praticamente igual à prevalência, e não sinalizou casos com o limiar fixo. As acurácias balanceadas foram 0,484 (RF) e 0,498 (XGB); AUCs próximas de 0,5 indicam discriminação insuficiente. Os resultados não justificam uso operacional como alerta.</w:t>
+        <w:t>As quedas corresponderam a 24,1% do teste. A Floresta Aleatória identificou 85 dos 289 casos (sensibilidade=0,29), mas gerou 296 falsos alertas e precisão de 0,22; sua AP (0,236) ficou abaixo da referência (0,241). O XGBoost teve AP=0,242, próxima à prevalência: não identificou quedas e gerou três falsos alertas. As acurácias balanceadas foram 0,484 (RF) e 0,498 (XGB); ROC-AUCs próximas de 0,5 indicam discriminação insuficiente. Os resultados não justificam uso operacional como alerta.</w:t>
       </w:r>
     </w:p>
     <w:p>
@@ -816,7 +832,7 @@
     <w:p>
       <w:pPr>
         <w:keepNext/>
-        <w:spacing w:after="60" w:before="100" w:line="240" w:lineRule="auto"/>
+        <w:spacing w:after="40" w:before="60" w:line="240" w:lineRule="auto"/>
         <w:jc w:val="left"/>
       </w:pPr>
       <w:r>
@@ -826,7 +842,7 @@
           <w:i w:val="0"/>
           <w:sz w:val="20"/>
         </w:rPr>
-        <w:t>4. Conclusión</w:t>
+        <w:t>4. Conclusão</w:t>
       </w:r>
     </w:p>
     <w:p>
@@ -847,7 +863,7 @@
     <w:p>
       <w:pPr>
         <w:keepNext/>
-        <w:spacing w:after="60" w:before="100" w:line="240" w:lineRule="auto"/>
+        <w:spacing w:after="40" w:before="60" w:line="240" w:lineRule="auto"/>
         <w:jc w:val="left"/>
       </w:pPr>
       <w:r>
@@ -902,7 +918,7 @@
           <w:i w:val="0"/>
           <w:sz w:val="13"/>
         </w:rPr>
-        <w:t>PALMA, O. et al. AI and data analytics in the dairy farms: a scoping review. Animals, 15(9), 1291, 2025. doi:10.3390/ani15091291.</w:t>
+        <w:t>CESARINI, L. et al. Comparison of deep learning models for milk production forecasting at national scale. Computers and Electronics in Agriculture, 221, 108933, 2024. doi:10.1016/j.compag.2024.108933.</w:t>
       </w:r>
     </w:p>
     <w:p>
@@ -917,7 +933,52 @@
           <w:i w:val="0"/>
           <w:sz w:val="13"/>
         </w:rPr>
+        <w:t>PALMA, O. et al. AI and data analytics in the dairy farms: a scoping review. Animals, 15(9), 1291, 2025. doi:10.3390/ani15091291.</w:t>
+      </w:r>
+    </w:p>
+    <w:p>
+      <w:pPr>
+        <w:spacing w:after="20" w:before="0" w:line="240" w:lineRule="auto"/>
+        <w:jc w:val="left"/>
+      </w:pPr>
+      <w:r>
+        <w:rPr>
+          <w:rFonts w:ascii="Times New Roman" w:hAnsi="Times New Roman"/>
+          <w:b w:val="0"/>
+          <w:i w:val="0"/>
+          <w:sz w:val="13"/>
+        </w:rPr>
+        <w:t>PEREZ-GUERRA, U. H. et al. Seasonal autoregressive integrated moving average (SARIMA) time-series model for milk production forecasting in pasture-based dairy cows in the Andean highlands. PLOS ONE, 18, e0288849, 2023. doi:10.1371/journal.pone.0288849.</w:t>
+      </w:r>
+    </w:p>
+    <w:p>
+      <w:pPr>
+        <w:spacing w:after="20" w:before="0" w:line="240" w:lineRule="auto"/>
+        <w:jc w:val="left"/>
+      </w:pPr>
+      <w:r>
+        <w:rPr>
+          <w:rFonts w:ascii="Times New Roman" w:hAnsi="Times New Roman"/>
+          <w:b w:val="0"/>
+          <w:i w:val="0"/>
+          <w:sz w:val="13"/>
+        </w:rPr>
         <w:t>SLOB, N.; CATAL, C.; KASSAHUN, A. Application of machine learning to improve dairy farm management. Preventive Veterinary Medicine, 187, 105237, 2021. doi:10.1016/j.prevetmed.2020.105237.</w:t>
+      </w:r>
+    </w:p>
+    <w:p>
+      <w:pPr>
+        <w:spacing w:after="20" w:before="0" w:line="240" w:lineRule="auto"/>
+        <w:jc w:val="left"/>
+      </w:pPr>
+      <w:r>
+        <w:rPr>
+          <w:rFonts w:ascii="Times New Roman" w:hAnsi="Times New Roman"/>
+          <w:b w:val="0"/>
+          <w:i w:val="0"/>
+          <w:sz w:val="13"/>
+        </w:rPr>
+        <w:t>VON BLOH, M. et al. Machine learning for soybean yield forecasting in Brazil. Agricultural and Forest Meteorology, 341, 109670, 2023. doi:10.1016/j.agrformet.2023.109670.</w:t>
       </w:r>
     </w:p>
     <w:sectPr>

</xml_diff>